<commit_message>
fix: update meeting notes and remove obsolete document
</commit_message>
<xml_diff>
--- a/meetings/Resum.docx
+++ b/meetings/Resum.docx
@@ -33,18 +33,8 @@
           <w:sz w:val="24"/>
           <w:szCs w:val="24"/>
         </w:rPr>
-        <w:t xml:space="preserve">09/10 Mostra dades trobades a </w:t>
+        <w:t>09/10 Mostra dades trobades a gtfs</w:t>
       </w:r>
-      <w:proofErr w:type="spellStart"/>
-      <w:r>
-        <w:rPr>
-          <w:rFonts w:ascii="Arial" w:hAnsi="Arial" w:cs="Arial"/>
-          <w:sz w:val="24"/>
-          <w:szCs w:val="24"/>
-        </w:rPr>
-        <w:t>gtfs</w:t>
-      </w:r>
-      <w:proofErr w:type="spellEnd"/>
     </w:p>
     <w:p>
       <w:pPr>
@@ -60,25 +50,7 @@
           <w:sz w:val="24"/>
           <w:szCs w:val="24"/>
         </w:rPr>
-        <w:t xml:space="preserve">06/02 Posar-nos al dia, </w:t>
-      </w:r>
-      <w:proofErr w:type="spellStart"/>
-      <w:r>
-        <w:rPr>
-          <w:rFonts w:ascii="Arial" w:hAnsi="Arial" w:cs="Arial"/>
-          <w:sz w:val="24"/>
-          <w:szCs w:val="24"/>
-        </w:rPr>
-        <w:t>redefinició</w:t>
-      </w:r>
-      <w:proofErr w:type="spellEnd"/>
-      <w:r>
-        <w:rPr>
-          <w:rFonts w:ascii="Arial" w:hAnsi="Arial" w:cs="Arial"/>
-          <w:sz w:val="24"/>
-          <w:szCs w:val="24"/>
-        </w:rPr>
-        <w:t xml:space="preserve"> de l’objectiu...</w:t>
+        <w:t>06/02 Posar-nos al dia, redefinició de l’objectiu...</w:t>
       </w:r>
     </w:p>
     <w:p>
@@ -96,6 +68,14 @@
           <w:szCs w:val="24"/>
         </w:rPr>
         <w:t xml:space="preserve">19/02 </w:t>
+      </w:r>
+      <w:r>
+        <w:rPr>
+          <w:rFonts w:ascii="Arial" w:hAnsi="Arial" w:cs="Arial"/>
+          <w:sz w:val="24"/>
+          <w:szCs w:val="24"/>
+        </w:rPr>
+        <w:t>Mostra de comprovacions de la qualitat de les dades, alguna idea per això...</w:t>
       </w:r>
     </w:p>
     <w:sectPr>

</xml_diff>